<commit_message>
Resolve customer entry point, flag courier entry point as open item
customer.html is confirmed as the canonical live customer app
(index.html is legacy). Courier's two entry points remain unresolved
per Dagi's confirmation that both carry the same recent modification
timestamp with no clear signal of which is live — documented as an
explicit open item requiring a production check rather than guessed.

Co-Authored-By: Claude Sonnet 5 <noreply@anthropic.com>
Claude-Session: https://claude.ai/code/session_013FexbCaN5zBjjVwdkjnS7s
</commit_message>
<xml_diff>
--- a/docs/SRS_Etel_Delivery_Ride.docx
+++ b/docs/SRS_Etel_Delivery_Ride.docx
@@ -5121,7 +5121,20 @@
         <w:spacing w:after="60"/>
       </w:pPr>
       <w:r>
-        <w:t xml:space="preserve">Two customer-facing HTML entry points exist (index.html and customer.html) and two courier entry points (courier/index.html and courier-index.html) — the canonical/live one should be confirmed and the other deprecated or documented as legacy.</w:t>
+        <w:t xml:space="preserve">Customer entry point confirmed: customer.html is the canonical/live customer app; index.html should be treated as legacy and either removed or clearly documented as deprecated.</w:t>
+      </w:r>
+    </w:p>
+    <w:p>
+      <w:pPr>
+        <w:pStyle w:val="ListParagraph"/>
+        <w:numPr>
+          <w:ilvl w:val="0"/>
+          <w:numId w:val="1"/>
+        </w:numPr>
+        <w:spacing w:after="60"/>
+      </w:pPr>
+      <w:r>
+        <w:t xml:space="preserve">Courier entry point still unresolved: courier/index.html and courier/courier-index.html both currently exist with the same recent modification timestamp, with no clear signal distinguishing which is live — recommend checking which one is actually linked from production navigation/login before deprecating either.</w:t>
       </w:r>
     </w:p>
     <w:p>

</xml_diff>